<commit_message>
pushing updated module 7 files
</commit_message>
<xml_diff>
--- a/module-7/Sengvanhpheng-Assignment_7_2.docx
+++ b/module-7/Sengvanhpheng-Assignment_7_2.docx
@@ -11,7 +11,15 @@
     <w:p>
       <w:r>
         <w:rPr/>
-        <w:t>July 2026</w:t>
+        <w:t>July</w:t>
+      </w:r>
+      <w:r>
+        <w:rPr/>
+        <w:t xml:space="preserve"> 11,</w:t>
+      </w:r>
+      <w:r>
+        <w:rPr/>
+        <w:t xml:space="preserve"> 2026</w:t>
       </w:r>
     </w:p>
     <w:p>
@@ -22,6 +30,40 @@
     </w:p>
     <w:p/>
     <w:p>
+      <w:pPr>
+        <w:rPr>
+          <w:b w:val="1"/>
+          <w:bCs w:val="1"/>
+        </w:rPr>
+      </w:pPr>
+      <w:r>
+        <w:rPr>
+          <w:b w:val="1"/>
+          <w:bCs w:val="1"/>
+        </w:rPr>
+        <w:t>Github</w:t>
+      </w:r>
+    </w:p>
+    <w:p>
+      <w:pPr>
+        <w:rPr>
+          <w:b w:val="1"/>
+          <w:bCs w:val="1"/>
+        </w:rPr>
+      </w:pPr>
+      <w:hyperlink r:id="R1fc6ae4905d54361">
+        <w:r>
+          <w:rPr>
+            <w:rStyle w:val="Hyperlink"/>
+            <w:b w:val="1"/>
+            <w:bCs w:val="1"/>
+          </w:rPr>
+          <w:t>https://github.com/ThyNoi/csd-325.git</w:t>
+        </w:r>
+      </w:hyperlink>
+    </w:p>
+    <w:p/>
+    <w:p>
       <w:r>
         <w:rPr/>
         <w:t>Write a function that accepts two parameters: a city name and a country name. The function should return a single string of the form City, Country, such as Santiago, Chile. Store the function in a file named city_functions.py. In the same file, call the function at least three times using a City, Country values.</w:t>
@@ -30,7 +72,7 @@
     <w:p>
       <w:r>
         <w:drawing>
-          <wp:inline wp14:editId="3AE07CCC" wp14:anchorId="0965531E">
+          <wp:inline wp14:editId="626BDE1E" wp14:anchorId="0965531E">
             <wp:extent cx="5943600" cy="3209925"/>
             <wp:effectExtent l="0" t="0" r="0" b="0"/>
             <wp:docPr id="611409598" name="drawing"/>
@@ -90,7 +132,7 @@
     <w:p>
       <w:r>
         <w:drawing>
-          <wp:inline wp14:editId="734C2973" wp14:anchorId="1CE1AEE4">
+          <wp:inline wp14:editId="616F8D4B" wp14:anchorId="1CE1AEE4">
             <wp:extent cx="5943600" cy="3219450"/>
             <wp:effectExtent l="0" t="0" r="0" b="0"/>
             <wp:docPr id="1261612110" name="drawing"/>
@@ -162,7 +204,7 @@
     <w:p>
       <w:r>
         <w:drawing>
-          <wp:inline wp14:editId="0EBF4DF9" wp14:anchorId="455D1113">
+          <wp:inline wp14:editId="0E7C2E90" wp14:anchorId="455D1113">
             <wp:extent cx="5943600" cy="3228975"/>
             <wp:effectExtent l="0" t="0" r="0" b="0"/>
             <wp:docPr id="1621058961" name="drawing"/>
@@ -248,7 +290,7 @@
       </w:pPr>
       <w:r>
         <w:drawing>
-          <wp:inline wp14:editId="516AD68E" wp14:anchorId="2C9798B9">
+          <wp:inline wp14:editId="29B0CBFD" wp14:anchorId="2C9798B9">
             <wp:extent cx="5943600" cy="3209925"/>
             <wp:effectExtent l="0" t="0" r="0" b="0"/>
             <wp:docPr id="63211487" name="drawing"/>
@@ -317,7 +359,7 @@
       </w:pPr>
       <w:r>
         <w:drawing>
-          <wp:inline wp14:editId="5DC81332" wp14:anchorId="42F924C1">
+          <wp:inline wp14:editId="3DBFB320" wp14:anchorId="42F924C1">
             <wp:extent cx="5943600" cy="3209925"/>
             <wp:effectExtent l="0" t="0" r="0" b="0"/>
             <wp:docPr id="890187310" name="drawing"/>
@@ -399,7 +441,7 @@
       </w:pPr>
       <w:r>
         <w:drawing>
-          <wp:inline wp14:editId="4081B708" wp14:anchorId="34E5B17B">
+          <wp:inline wp14:editId="3BD3D2EB" wp14:anchorId="34E5B17B">
             <wp:extent cx="5943600" cy="3200400"/>
             <wp:effectExtent l="0" t="0" r="0" b="0"/>
             <wp:docPr id="145241478" name="drawing"/>
@@ -456,7 +498,7 @@
       </w:pPr>
       <w:r>
         <w:drawing>
-          <wp:inline wp14:editId="28DD43AA" wp14:anchorId="2AF29E0C">
+          <wp:inline wp14:editId="759A62E2" wp14:anchorId="2AF29E0C">
             <wp:extent cx="5943600" cy="3219450"/>
             <wp:effectExtent l="0" t="0" r="0" b="0"/>
             <wp:docPr id="1482782277" name="drawing"/>
@@ -929,6 +971,17 @@
     <w:semiHidden/>
     <w:unhideWhenUsed/>
   </w:style>
+  <w:style w:type="character" w:styleId="Hyperlink">
+    <w:uiPriority w:val="99"/>
+    <w:name w:val="Hyperlink"/>
+    <w:basedOn w:val="DefaultParagraphFont"/>
+    <w:unhideWhenUsed/>
+    <w:rsid w:val="3CD38460"/>
+    <w:rPr>
+      <w:color w:val="467886"/>
+      <w:u w:val="single"/>
+    </w:rPr>
+  </w:style>
 </w:styles>
 </file>
 

</xml_diff>